<commit_message>
docs: add sham-search control results and refresh final report
- Record C-real 4/5 vs C-sham 4/5 on the 5-task control; no real-only or sham-only resolutions.
- Conclude memory as a negative result and stop the 50-task memory comparison.
- Refresh the DOCX/PDF report and test counts (690 passed).
</commit_message>
<xml_diff>
--- a/deliverables_final/report_20261019.docx
+++ b/deliverables_final/report_20261019.docx
@@ -2272,6 +2272,20 @@
     </w:p>
     <w:p>
       <w:pPr>
+        <w:spacing w:before="160" w:after="80"/>
+      </w:pPr>
+      <w:r>
+        <w:rPr>
+          <w:rFonts w:ascii="PingFang SC" w:hAnsi="PingFang SC" w:eastAsia="PingFang SC"/>
+          <w:b/>
+          <w:color w:val="1F3B57"/>
+          <w:sz w:val="26"/>
+        </w:rPr>
+        <w:t>3.1 Sham-search 控制（2026-10-19）</w:t>
+      </w:r>
+    </w:p>
+    <w:p>
+      <w:pPr>
         <w:spacing w:after="100" w:line="300" w:lineRule="auto"/>
       </w:pPr>
       <w:r>
@@ -2280,7 +2294,370 @@
           <w:b w:val="0"/>
           <w:sz w:val="21"/>
         </w:rPr>
-        <w:t>因此当前结论是：memory 基础设施可运行、可审计，但没有证明性能收益；A（window）在本轮最好。若继续研究，需要 sham-search 控制、覆盖 bash 写操作的 gate、3 轮 × 10 题或 50 题两轮，而不是把 p2final 当作最终证据。</w:t>
+        <w:t>为把“有用检索”与“只是多了一个工具/提示/gate”分开，增加 C-sham 控制：同名、同 schema、同描述、同 gate，但 memory_search 始终返回 No matching messages，retrieval_tokens=0。C-real 与 C-sham 使用同一源码、5 题、同一预算和提示，只有返回内容不同。</w:t>
+      </w:r>
+    </w:p>
+    <w:tbl>
+      <w:tblPr>
+        <w:tblStyle w:val="TableGrid"/>
+        <w:tblW w:type="auto" w:w="0"/>
+        <w:jc w:val="center"/>
+        <w:tblLook w:firstColumn="1" w:firstRow="1" w:lastColumn="0" w:lastRow="0" w:noHBand="0" w:noVBand="1" w:val="04A0"/>
+      </w:tblPr>
+      <w:tblGrid>
+        <w:gridCol w:w="1949"/>
+        <w:gridCol w:w="1949"/>
+        <w:gridCol w:w="1949"/>
+        <w:gridCol w:w="1949"/>
+        <w:gridCol w:w="1949"/>
+      </w:tblGrid>
+      <w:tr>
+        <w:tc>
+          <w:tcPr>
+            <w:tcW w:type="dxa" w:w="1474"/>
+            <w:shd w:fill="2F5597"/>
+          </w:tcPr>
+          <w:p>
+            <w:pPr>
+              <w:jc w:val="center"/>
+            </w:pPr>
+            <w:r/>
+            <w:r>
+              <w:rPr>
+                <w:rFonts w:ascii="PingFang SC" w:hAnsi="PingFang SC" w:eastAsia="PingFang SC"/>
+                <w:b/>
+                <w:color w:val="FFFFFF"/>
+                <w:sz w:val="18"/>
+              </w:rPr>
+              <w:t>C 变体</w:t>
+            </w:r>
+          </w:p>
+        </w:tc>
+        <w:tc>
+          <w:tcPr>
+            <w:tcW w:type="dxa" w:w="1474"/>
+            <w:shd w:fill="2F5597"/>
+          </w:tcPr>
+          <w:p>
+            <w:pPr>
+              <w:jc w:val="center"/>
+            </w:pPr>
+            <w:r/>
+            <w:r>
+              <w:rPr>
+                <w:rFonts w:ascii="PingFang SC" w:hAnsi="PingFang SC" w:eastAsia="PingFang SC"/>
+                <w:b/>
+                <w:color w:val="FFFFFF"/>
+                <w:sz w:val="18"/>
+              </w:rPr>
+              <w:t>Resolved</w:t>
+            </w:r>
+          </w:p>
+        </w:tc>
+        <w:tc>
+          <w:tcPr>
+            <w:tcW w:type="dxa" w:w="1701"/>
+            <w:shd w:fill="2F5597"/>
+          </w:tcPr>
+          <w:p>
+            <w:pPr>
+              <w:jc w:val="center"/>
+            </w:pPr>
+            <w:r/>
+            <w:r>
+              <w:rPr>
+                <w:rFonts w:ascii="PingFang SC" w:hAnsi="PingFang SC" w:eastAsia="PingFang SC"/>
+                <w:b/>
+                <w:color w:val="FFFFFF"/>
+                <w:sz w:val="18"/>
+              </w:rPr>
+              <w:t>Cost</w:t>
+            </w:r>
+          </w:p>
+        </w:tc>
+        <w:tc>
+          <w:tcPr>
+            <w:tcW w:type="dxa" w:w="1587"/>
+            <w:shd w:fill="2F5597"/>
+          </w:tcPr>
+          <w:p>
+            <w:pPr>
+              <w:jc w:val="center"/>
+            </w:pPr>
+            <w:r/>
+            <w:r>
+              <w:rPr>
+                <w:rFonts w:ascii="PingFang SC" w:hAnsi="PingFang SC" w:eastAsia="PingFang SC"/>
+                <w:b/>
+                <w:color w:val="FFFFFF"/>
+                <w:sz w:val="18"/>
+              </w:rPr>
+              <w:t>Calls</w:t>
+            </w:r>
+          </w:p>
+        </w:tc>
+        <w:tc>
+          <w:tcPr>
+            <w:tcW w:type="dxa" w:w="1814"/>
+            <w:shd w:fill="2F5597"/>
+          </w:tcPr>
+          <w:p>
+            <w:pPr>
+              <w:jc w:val="center"/>
+            </w:pPr>
+            <w:r/>
+            <w:r>
+              <w:rPr>
+                <w:rFonts w:ascii="PingFang SC" w:hAnsi="PingFang SC" w:eastAsia="PingFang SC"/>
+                <w:b/>
+                <w:color w:val="FFFFFF"/>
+                <w:sz w:val="18"/>
+              </w:rPr>
+              <w:t>Search calls</w:t>
+            </w:r>
+          </w:p>
+        </w:tc>
+      </w:tr>
+      <w:tr>
+        <w:tc>
+          <w:tcPr>
+            <w:tcW w:type="dxa" w:w="1474"/>
+          </w:tcPr>
+          <w:p>
+            <w:pPr>
+              <w:jc w:val="left"/>
+            </w:pPr>
+            <w:r/>
+            <w:r>
+              <w:rPr>
+                <w:rFonts w:ascii="PingFang SC" w:hAnsi="PingFang SC" w:eastAsia="PingFang SC"/>
+                <w:sz w:val="18"/>
+              </w:rPr>
+              <w:t>real</w:t>
+            </w:r>
+          </w:p>
+        </w:tc>
+        <w:tc>
+          <w:tcPr>
+            <w:tcW w:type="dxa" w:w="1474"/>
+          </w:tcPr>
+          <w:p>
+            <w:pPr>
+              <w:jc w:val="center"/>
+            </w:pPr>
+            <w:r/>
+            <w:r>
+              <w:rPr>
+                <w:rFonts w:ascii="PingFang SC" w:hAnsi="PingFang SC" w:eastAsia="PingFang SC"/>
+                <w:sz w:val="18"/>
+              </w:rPr>
+              <w:t>4/5</w:t>
+            </w:r>
+          </w:p>
+        </w:tc>
+        <w:tc>
+          <w:tcPr>
+            <w:tcW w:type="dxa" w:w="1701"/>
+          </w:tcPr>
+          <w:p>
+            <w:pPr>
+              <w:jc w:val="center"/>
+            </w:pPr>
+            <w:r/>
+            <w:r>
+              <w:rPr>
+                <w:rFonts w:ascii="PingFang SC" w:hAnsi="PingFang SC" w:eastAsia="PingFang SC"/>
+                <w:sz w:val="18"/>
+              </w:rPr>
+              <w:t>$0.1802</w:t>
+            </w:r>
+          </w:p>
+        </w:tc>
+        <w:tc>
+          <w:tcPr>
+            <w:tcW w:type="dxa" w:w="1587"/>
+          </w:tcPr>
+          <w:p>
+            <w:pPr>
+              <w:jc w:val="center"/>
+            </w:pPr>
+            <w:r/>
+            <w:r>
+              <w:rPr>
+                <w:rFonts w:ascii="PingFang SC" w:hAnsi="PingFang SC" w:eastAsia="PingFang SC"/>
+                <w:sz w:val="18"/>
+              </w:rPr>
+              <w:t>185</w:t>
+            </w:r>
+          </w:p>
+        </w:tc>
+        <w:tc>
+          <w:tcPr>
+            <w:tcW w:type="dxa" w:w="1814"/>
+          </w:tcPr>
+          <w:p>
+            <w:pPr>
+              <w:jc w:val="center"/>
+            </w:pPr>
+            <w:r/>
+            <w:r>
+              <w:rPr>
+                <w:rFonts w:ascii="PingFang SC" w:hAnsi="PingFang SC" w:eastAsia="PingFang SC"/>
+                <w:sz w:val="18"/>
+              </w:rPr>
+              <w:t>5</w:t>
+            </w:r>
+          </w:p>
+        </w:tc>
+      </w:tr>
+      <w:tr>
+        <w:tc>
+          <w:tcPr>
+            <w:tcW w:type="dxa" w:w="1474"/>
+          </w:tcPr>
+          <w:p>
+            <w:pPr>
+              <w:jc w:val="left"/>
+            </w:pPr>
+            <w:r/>
+            <w:r>
+              <w:rPr>
+                <w:rFonts w:ascii="PingFang SC" w:hAnsi="PingFang SC" w:eastAsia="PingFang SC"/>
+                <w:sz w:val="18"/>
+              </w:rPr>
+              <w:t>sham</w:t>
+            </w:r>
+          </w:p>
+        </w:tc>
+        <w:tc>
+          <w:tcPr>
+            <w:tcW w:type="dxa" w:w="1474"/>
+          </w:tcPr>
+          <w:p>
+            <w:pPr>
+              <w:jc w:val="center"/>
+            </w:pPr>
+            <w:r/>
+            <w:r>
+              <w:rPr>
+                <w:rFonts w:ascii="PingFang SC" w:hAnsi="PingFang SC" w:eastAsia="PingFang SC"/>
+                <w:sz w:val="18"/>
+              </w:rPr>
+              <w:t>4/5</w:t>
+            </w:r>
+          </w:p>
+        </w:tc>
+        <w:tc>
+          <w:tcPr>
+            <w:tcW w:type="dxa" w:w="1701"/>
+          </w:tcPr>
+          <w:p>
+            <w:pPr>
+              <w:jc w:val="center"/>
+            </w:pPr>
+            <w:r/>
+            <w:r>
+              <w:rPr>
+                <w:rFonts w:ascii="PingFang SC" w:hAnsi="PingFang SC" w:eastAsia="PingFang SC"/>
+                <w:sz w:val="18"/>
+              </w:rPr>
+              <w:t>$0.3599</w:t>
+            </w:r>
+          </w:p>
+        </w:tc>
+        <w:tc>
+          <w:tcPr>
+            <w:tcW w:type="dxa" w:w="1587"/>
+          </w:tcPr>
+          <w:p>
+            <w:pPr>
+              <w:jc w:val="center"/>
+            </w:pPr>
+            <w:r/>
+            <w:r>
+              <w:rPr>
+                <w:rFonts w:ascii="PingFang SC" w:hAnsi="PingFang SC" w:eastAsia="PingFang SC"/>
+                <w:sz w:val="18"/>
+              </w:rPr>
+              <w:t>294</w:t>
+            </w:r>
+          </w:p>
+        </w:tc>
+        <w:tc>
+          <w:tcPr>
+            <w:tcW w:type="dxa" w:w="1814"/>
+          </w:tcPr>
+          <w:p>
+            <w:pPr>
+              <w:jc w:val="center"/>
+            </w:pPr>
+            <w:r/>
+            <w:r>
+              <w:rPr>
+                <w:rFonts w:ascii="PingFang SC" w:hAnsi="PingFang SC" w:eastAsia="PingFang SC"/>
+                <w:sz w:val="18"/>
+              </w:rPr>
+              <w:t>8</w:t>
+            </w:r>
+          </w:p>
+        </w:tc>
+      </w:tr>
+    </w:tbl>
+    <w:p>
+      <w:pPr>
+        <w:spacing w:after="40"/>
+      </w:pPr>
+    </w:p>
+    <w:p>
+      <w:pPr>
+        <w:pStyle w:val="ListBullet"/>
+        <w:spacing w:after="40"/>
+      </w:pPr>
+      <w:r>
+        <w:rPr>
+          <w:rFonts w:ascii="PingFang SC" w:hAnsi="PingFang SC" w:eastAsia="PingFang SC"/>
+          <w:sz w:val="21"/>
+        </w:rPr>
+        <w:t>两者解决同一组任务（11333、14855、15315、8721），都失败 11532；没有 real-only 或 sham-only。</w:t>
+      </w:r>
+    </w:p>
+    <w:p>
+      <w:pPr>
+        <w:pStyle w:val="ListBullet"/>
+        <w:spacing w:after="40"/>
+      </w:pPr>
+      <w:r>
+        <w:rPr>
+          <w:rFonts w:ascii="PingFang SC" w:hAnsi="PingFang SC" w:eastAsia="PingFang SC"/>
+          <w:sz w:val="21"/>
+        </w:rPr>
+        <w:t>sham 更贵、检索更多，说明无内容时模型会重试/重读；这不是检索有效的证据。</w:t>
+      </w:r>
+    </w:p>
+    <w:p>
+      <w:pPr>
+        <w:pStyle w:val="ListBullet"/>
+        <w:spacing w:after="40"/>
+      </w:pPr>
+      <w:r>
+        <w:rPr>
+          <w:rFonts w:ascii="PingFang SC" w:hAnsi="PingFang SC" w:eastAsia="PingFang SC"/>
+          <w:sz w:val="21"/>
+        </w:rPr>
+        <w:t>5 题没有统计功效；只能说明当前 C 在这组题上没有可见收益，不能证明检索普适无效。</w:t>
+      </w:r>
+    </w:p>
+    <w:p>
+      <w:pPr>
+        <w:spacing w:after="100" w:line="300" w:lineRule="auto"/>
+      </w:pPr>
+      <w:r>
+        <w:rPr>
+          <w:rFonts w:ascii="PingFang SC" w:hAnsi="PingFang SC" w:eastAsia="PingFang SC"/>
+          <w:b w:val="0"/>
+          <w:sz w:val="21"/>
+        </w:rPr>
+        <w:t>因此当前结论是：memory 基础设施可运行、可审计，但没有证明性能收益；A（window）在本轮最好。sham 控制也没有显示检索收益。若继续研究，需要覆盖 bash 写操作的 gate、按“证据确实被挤出”选任务、以及 10 题 × 2–3 轮的 C-real/C-sham 对照；当前不应继续 50 题 memory 实验。</w:t>
       </w:r>
     </w:p>
     <w:p>
@@ -2788,7 +3165,7 @@
           <w:rFonts w:ascii="PingFang SC" w:hAnsi="PingFang SC" w:eastAsia="PingFang SC"/>
           <w:sz w:val="21"/>
         </w:rPr>
-        <w:t>本机：688 passed, 18 skipped, 52 deselected；Ruff 通过。</w:t>
+        <w:t>本机：690 passed, 18 skipped, 52 deselected；Ruff 通过。</w:t>
       </w:r>
     </w:p>
     <w:p>
@@ -3095,7 +3472,7 @@
                 <w:rFonts w:ascii="PingFang SC" w:hAnsi="PingFang SC" w:eastAsia="PingFang SC"/>
                 <w:sz w:val="18"/>
               </w:rPr>
-              <w:t>p2final C−B=0；C 仅 3 次 search</w:t>
+              <w:t>p2final C−B=0；C 仅 3 次 search；sham 4/5 vs 4/5</w:t>
             </w:r>
           </w:p>
         </w:tc>
@@ -3286,7 +3663,7 @@
           <w:rFonts w:ascii="PingFang SC" w:hAnsi="PingFang SC" w:eastAsia="PingFang SC"/>
           <w:sz w:val="21"/>
         </w:rPr>
-        <w:t>P0：memory 二选一——写负结果收尾，或用 sham-search + 覆盖 bash 的 gate 重做 3 轮。</w:t>
+        <w:t>P0：memory 以负结果收尾；sham 5 题无收益，不再跑 50 题 memory 对照。</w:t>
       </w:r>
     </w:p>
     <w:p>
@@ -3444,6 +3821,44 @@
                 <w:sz w:val="18"/>
               </w:rPr>
               <w:t>experiments/memory_abc_20261019/PILOT_P2FINAL_20261019.md</w:t>
+            </w:r>
+          </w:p>
+        </w:tc>
+      </w:tr>
+      <w:tr>
+        <w:tc>
+          <w:tcPr>
+            <w:tcW w:type="dxa" w:w="2381"/>
+          </w:tcPr>
+          <w:p>
+            <w:pPr>
+              <w:jc w:val="left"/>
+            </w:pPr>
+            <w:r/>
+            <w:r>
+              <w:rPr>
+                <w:rFonts w:ascii="PingFang SC" w:hAnsi="PingFang SC" w:eastAsia="PingFang SC"/>
+                <w:sz w:val="18"/>
+              </w:rPr>
+              <w:t>sham 控制</w:t>
+            </w:r>
+          </w:p>
+        </w:tc>
+        <w:tc>
+          <w:tcPr>
+            <w:tcW w:type="dxa" w:w="6803"/>
+          </w:tcPr>
+          <w:p>
+            <w:pPr>
+              <w:jc w:val="center"/>
+            </w:pPr>
+            <w:r/>
+            <w:r>
+              <w:rPr>
+                <w:rFonts w:ascii="PingFang SC" w:hAnsi="PingFang SC" w:eastAsia="PingFang SC"/>
+                <w:sz w:val="18"/>
+              </w:rPr>
+              <w:t>experiments/memory_abc_20261019/SHAM_20261019.md</w:t>
             </w:r>
           </w:p>
         </w:tc>

</xml_diff>

<commit_message>
docs: record four-arm tool ablation and update final report
- Four-arm round: baseline 8/10, brief 8/10, retrieval 9/10, gate 9/10.
- Plain retrieval made zero retrieval tool calls; gate forced 10 calls but no resolved gain and doubled cost.
- Stop the same-config second round and require tool-exposure fix or a package-level gate treatment.
- Update the DOCX/PDF report and README.
</commit_message>
<xml_diff>
--- a/deliverables_final/report_20261019.docx
+++ b/deliverables_final/report_20261019.docx
@@ -99,7 +99,7 @@
           <w:b w:val="0"/>
           <w:sz w:val="21"/>
         </w:rPr>
-        <w:t>结论先行：工程实现和可复现性较强，离线 localization 有明确信号；但 2026-10-19 的 A/B/C p2final（A 9/10、B 7/10、C 7/10，C 仅 3 次 memory_search，C−B=0）是一次有效 run，却不是检索的因果实验。当前不能声称 memory/search 提升 SWE-bench；repair workflow 也还没有在线对照。报告因此把“已验证的工程能力”和“尚未验证的性能收益”明确分开。</w:t>
+        <w:t>结论先行：工程实现和可复现性较强，离线 localization 有明确信号；但 2026-10-19 的 A/B/C p2final（A 9/10、B 7/10、C 7/10，C 仅 3 次 memory_search，C−B=0）是一次有效 run，却不是检索的因果实验。当前不能声称 memory/search 提升 SWE-bench；repair workflow 也还没有在线对照。报告因此把“已验证的工程能力”和“尚未验证的性能收益”明确分开。四臂工具 ablation 的首轮结果为 8/8/9/9，但 plain retrieval 臂没有调用任何检索工具，因此同样不能归因于工具效应。</w:t>
       </w:r>
     </w:p>
     <w:p>
@@ -3103,6 +3103,580 @@
     </w:p>
     <w:p>
       <w:pPr>
+        <w:spacing w:before="160" w:after="80"/>
+      </w:pPr>
+      <w:r>
+        <w:rPr>
+          <w:rFonts w:ascii="PingFang SC" w:hAnsi="PingFang SC" w:eastAsia="PingFang SC"/>
+          <w:b/>
+          <w:color w:val="1F3B57"/>
+          <w:sz w:val="26"/>
+        </w:rPr>
+        <w:t>4.1 四臂工具 ablation（2026-10-19，一轮）</w:t>
+      </w:r>
+    </w:p>
+    <w:p>
+      <w:pPr>
+        <w:spacing w:after="100" w:line="300" w:lineRule="auto"/>
+      </w:pPr>
+      <w:r>
+        <w:rPr>
+          <w:rFonts w:ascii="PingFang SC" w:hAnsi="PingFang SC" w:eastAsia="PingFang SC"/>
+          <w:b w:val="0"/>
+          <w:sz w:val="21"/>
+        </w:rPr>
+        <w:t>同一源码、10 题、2 workers、官方 grading；四臂分别为 baseline、brief、retrieval、gate。</w:t>
+      </w:r>
+    </w:p>
+    <w:tbl>
+      <w:tblPr>
+        <w:tblStyle w:val="TableGrid"/>
+        <w:tblW w:type="auto" w:w="0"/>
+        <w:jc w:val="center"/>
+        <w:tblLook w:firstColumn="1" w:firstRow="1" w:lastColumn="0" w:lastRow="0" w:noHBand="0" w:noVBand="1" w:val="04A0"/>
+      </w:tblPr>
+      <w:tblGrid>
+        <w:gridCol w:w="1949"/>
+        <w:gridCol w:w="1949"/>
+        <w:gridCol w:w="1949"/>
+        <w:gridCol w:w="1949"/>
+        <w:gridCol w:w="1949"/>
+      </w:tblGrid>
+      <w:tr>
+        <w:tc>
+          <w:tcPr>
+            <w:tcW w:type="dxa" w:w="1361"/>
+            <w:shd w:fill="2F5597"/>
+          </w:tcPr>
+          <w:p>
+            <w:pPr>
+              <w:jc w:val="center"/>
+            </w:pPr>
+            <w:r/>
+            <w:r>
+              <w:rPr>
+                <w:rFonts w:ascii="PingFang SC" w:hAnsi="PingFang SC" w:eastAsia="PingFang SC"/>
+                <w:b/>
+                <w:color w:val="FFFFFF"/>
+                <w:sz w:val="18"/>
+              </w:rPr>
+              <w:t>Arm</w:t>
+            </w:r>
+          </w:p>
+        </w:tc>
+        <w:tc>
+          <w:tcPr>
+            <w:tcW w:type="dxa" w:w="1361"/>
+            <w:shd w:fill="2F5597"/>
+          </w:tcPr>
+          <w:p>
+            <w:pPr>
+              <w:jc w:val="center"/>
+            </w:pPr>
+            <w:r/>
+            <w:r>
+              <w:rPr>
+                <w:rFonts w:ascii="PingFang SC" w:hAnsi="PingFang SC" w:eastAsia="PingFang SC"/>
+                <w:b/>
+                <w:color w:val="FFFFFF"/>
+                <w:sz w:val="18"/>
+              </w:rPr>
+              <w:t>Resolved</w:t>
+            </w:r>
+          </w:p>
+        </w:tc>
+        <w:tc>
+          <w:tcPr>
+            <w:tcW w:type="dxa" w:w="1587"/>
+            <w:shd w:fill="2F5597"/>
+          </w:tcPr>
+          <w:p>
+            <w:pPr>
+              <w:jc w:val="center"/>
+            </w:pPr>
+            <w:r/>
+            <w:r>
+              <w:rPr>
+                <w:rFonts w:ascii="PingFang SC" w:hAnsi="PingFang SC" w:eastAsia="PingFang SC"/>
+                <w:b/>
+                <w:color w:val="FFFFFF"/>
+                <w:sz w:val="18"/>
+              </w:rPr>
+              <w:t>Cost</w:t>
+            </w:r>
+          </w:p>
+        </w:tc>
+        <w:tc>
+          <w:tcPr>
+            <w:tcW w:type="dxa" w:w="1474"/>
+            <w:shd w:fill="2F5597"/>
+          </w:tcPr>
+          <w:p>
+            <w:pPr>
+              <w:jc w:val="center"/>
+            </w:pPr>
+            <w:r/>
+            <w:r>
+              <w:rPr>
+                <w:rFonts w:ascii="PingFang SC" w:hAnsi="PingFang SC" w:eastAsia="PingFang SC"/>
+                <w:b/>
+                <w:color w:val="FFFFFF"/>
+                <w:sz w:val="18"/>
+              </w:rPr>
+              <w:t>Calls</w:t>
+            </w:r>
+          </w:p>
+        </w:tc>
+        <w:tc>
+          <w:tcPr>
+            <w:tcW w:type="dxa" w:w="2268"/>
+            <w:shd w:fill="2F5597"/>
+          </w:tcPr>
+          <w:p>
+            <w:pPr>
+              <w:jc w:val="center"/>
+            </w:pPr>
+            <w:r/>
+            <w:r>
+              <w:rPr>
+                <w:rFonts w:ascii="PingFang SC" w:hAnsi="PingFang SC" w:eastAsia="PingFang SC"/>
+                <w:b/>
+                <w:color w:val="FFFFFF"/>
+                <w:sz w:val="18"/>
+              </w:rPr>
+              <w:t>Retrieval tool calls</w:t>
+            </w:r>
+          </w:p>
+        </w:tc>
+      </w:tr>
+      <w:tr>
+        <w:tc>
+          <w:tcPr>
+            <w:tcW w:type="dxa" w:w="1361"/>
+          </w:tcPr>
+          <w:p>
+            <w:pPr>
+              <w:jc w:val="left"/>
+            </w:pPr>
+            <w:r/>
+            <w:r>
+              <w:rPr>
+                <w:rFonts w:ascii="PingFang SC" w:hAnsi="PingFang SC" w:eastAsia="PingFang SC"/>
+                <w:sz w:val="18"/>
+              </w:rPr>
+              <w:t>baseline</w:t>
+            </w:r>
+          </w:p>
+        </w:tc>
+        <w:tc>
+          <w:tcPr>
+            <w:tcW w:type="dxa" w:w="1361"/>
+          </w:tcPr>
+          <w:p>
+            <w:pPr>
+              <w:jc w:val="center"/>
+            </w:pPr>
+            <w:r/>
+            <w:r>
+              <w:rPr>
+                <w:rFonts w:ascii="PingFang SC" w:hAnsi="PingFang SC" w:eastAsia="PingFang SC"/>
+                <w:sz w:val="18"/>
+              </w:rPr>
+              <w:t>8/10</w:t>
+            </w:r>
+          </w:p>
+        </w:tc>
+        <w:tc>
+          <w:tcPr>
+            <w:tcW w:type="dxa" w:w="1587"/>
+          </w:tcPr>
+          <w:p>
+            <w:pPr>
+              <w:jc w:val="center"/>
+            </w:pPr>
+            <w:r/>
+            <w:r>
+              <w:rPr>
+                <w:rFonts w:ascii="PingFang SC" w:hAnsi="PingFang SC" w:eastAsia="PingFang SC"/>
+                <w:sz w:val="18"/>
+              </w:rPr>
+              <w:t>$0.1023</w:t>
+            </w:r>
+          </w:p>
+        </w:tc>
+        <w:tc>
+          <w:tcPr>
+            <w:tcW w:type="dxa" w:w="1474"/>
+          </w:tcPr>
+          <w:p>
+            <w:pPr>
+              <w:jc w:val="center"/>
+            </w:pPr>
+            <w:r/>
+            <w:r>
+              <w:rPr>
+                <w:rFonts w:ascii="PingFang SC" w:hAnsi="PingFang SC" w:eastAsia="PingFang SC"/>
+                <w:sz w:val="18"/>
+              </w:rPr>
+              <w:t>217</w:t>
+            </w:r>
+          </w:p>
+        </w:tc>
+        <w:tc>
+          <w:tcPr>
+            <w:tcW w:type="dxa" w:w="2268"/>
+          </w:tcPr>
+          <w:p>
+            <w:pPr>
+              <w:jc w:val="center"/>
+            </w:pPr>
+            <w:r/>
+            <w:r>
+              <w:rPr>
+                <w:rFonts w:ascii="PingFang SC" w:hAnsi="PingFang SC" w:eastAsia="PingFang SC"/>
+                <w:sz w:val="18"/>
+              </w:rPr>
+              <w:t>0</w:t>
+            </w:r>
+          </w:p>
+        </w:tc>
+      </w:tr>
+      <w:tr>
+        <w:tc>
+          <w:tcPr>
+            <w:tcW w:type="dxa" w:w="1361"/>
+          </w:tcPr>
+          <w:p>
+            <w:pPr>
+              <w:jc w:val="left"/>
+            </w:pPr>
+            <w:r/>
+            <w:r>
+              <w:rPr>
+                <w:rFonts w:ascii="PingFang SC" w:hAnsi="PingFang SC" w:eastAsia="PingFang SC"/>
+                <w:sz w:val="18"/>
+              </w:rPr>
+              <w:t>brief</w:t>
+            </w:r>
+          </w:p>
+        </w:tc>
+        <w:tc>
+          <w:tcPr>
+            <w:tcW w:type="dxa" w:w="1361"/>
+          </w:tcPr>
+          <w:p>
+            <w:pPr>
+              <w:jc w:val="center"/>
+            </w:pPr>
+            <w:r/>
+            <w:r>
+              <w:rPr>
+                <w:rFonts w:ascii="PingFang SC" w:hAnsi="PingFang SC" w:eastAsia="PingFang SC"/>
+                <w:sz w:val="18"/>
+              </w:rPr>
+              <w:t>8/10</w:t>
+            </w:r>
+          </w:p>
+        </w:tc>
+        <w:tc>
+          <w:tcPr>
+            <w:tcW w:type="dxa" w:w="1587"/>
+          </w:tcPr>
+          <w:p>
+            <w:pPr>
+              <w:jc w:val="center"/>
+            </w:pPr>
+            <w:r/>
+            <w:r>
+              <w:rPr>
+                <w:rFonts w:ascii="PingFang SC" w:hAnsi="PingFang SC" w:eastAsia="PingFang SC"/>
+                <w:sz w:val="18"/>
+              </w:rPr>
+              <w:t>$0.0806</w:t>
+            </w:r>
+          </w:p>
+        </w:tc>
+        <w:tc>
+          <w:tcPr>
+            <w:tcW w:type="dxa" w:w="1474"/>
+          </w:tcPr>
+          <w:p>
+            <w:pPr>
+              <w:jc w:val="center"/>
+            </w:pPr>
+            <w:r/>
+            <w:r>
+              <w:rPr>
+                <w:rFonts w:ascii="PingFang SC" w:hAnsi="PingFang SC" w:eastAsia="PingFang SC"/>
+                <w:sz w:val="18"/>
+              </w:rPr>
+              <w:t>201</w:t>
+            </w:r>
+          </w:p>
+        </w:tc>
+        <w:tc>
+          <w:tcPr>
+            <w:tcW w:type="dxa" w:w="2268"/>
+          </w:tcPr>
+          <w:p>
+            <w:pPr>
+              <w:jc w:val="center"/>
+            </w:pPr>
+            <w:r/>
+            <w:r>
+              <w:rPr>
+                <w:rFonts w:ascii="PingFang SC" w:hAnsi="PingFang SC" w:eastAsia="PingFang SC"/>
+                <w:sz w:val="18"/>
+              </w:rPr>
+              <w:t>0</w:t>
+            </w:r>
+          </w:p>
+        </w:tc>
+      </w:tr>
+      <w:tr>
+        <w:tc>
+          <w:tcPr>
+            <w:tcW w:type="dxa" w:w="1361"/>
+          </w:tcPr>
+          <w:p>
+            <w:pPr>
+              <w:jc w:val="left"/>
+            </w:pPr>
+            <w:r/>
+            <w:r>
+              <w:rPr>
+                <w:rFonts w:ascii="PingFang SC" w:hAnsi="PingFang SC" w:eastAsia="PingFang SC"/>
+                <w:sz w:val="18"/>
+              </w:rPr>
+              <w:t>retrieval</w:t>
+            </w:r>
+          </w:p>
+        </w:tc>
+        <w:tc>
+          <w:tcPr>
+            <w:tcW w:type="dxa" w:w="1361"/>
+          </w:tcPr>
+          <w:p>
+            <w:pPr>
+              <w:jc w:val="center"/>
+            </w:pPr>
+            <w:r/>
+            <w:r>
+              <w:rPr>
+                <w:rFonts w:ascii="PingFang SC" w:hAnsi="PingFang SC" w:eastAsia="PingFang SC"/>
+                <w:sz w:val="18"/>
+              </w:rPr>
+              <w:t>9/10</w:t>
+            </w:r>
+          </w:p>
+        </w:tc>
+        <w:tc>
+          <w:tcPr>
+            <w:tcW w:type="dxa" w:w="1587"/>
+          </w:tcPr>
+          <w:p>
+            <w:pPr>
+              <w:jc w:val="center"/>
+            </w:pPr>
+            <w:r/>
+            <w:r>
+              <w:rPr>
+                <w:rFonts w:ascii="PingFang SC" w:hAnsi="PingFang SC" w:eastAsia="PingFang SC"/>
+                <w:sz w:val="18"/>
+              </w:rPr>
+              <w:t>$0.0499</w:t>
+            </w:r>
+          </w:p>
+        </w:tc>
+        <w:tc>
+          <w:tcPr>
+            <w:tcW w:type="dxa" w:w="1474"/>
+          </w:tcPr>
+          <w:p>
+            <w:pPr>
+              <w:jc w:val="center"/>
+            </w:pPr>
+            <w:r/>
+            <w:r>
+              <w:rPr>
+                <w:rFonts w:ascii="PingFang SC" w:hAnsi="PingFang SC" w:eastAsia="PingFang SC"/>
+                <w:sz w:val="18"/>
+              </w:rPr>
+              <w:t>139</w:t>
+            </w:r>
+          </w:p>
+        </w:tc>
+        <w:tc>
+          <w:tcPr>
+            <w:tcW w:type="dxa" w:w="2268"/>
+          </w:tcPr>
+          <w:p>
+            <w:pPr>
+              <w:jc w:val="center"/>
+            </w:pPr>
+            <w:r/>
+            <w:r>
+              <w:rPr>
+                <w:rFonts w:ascii="PingFang SC" w:hAnsi="PingFang SC" w:eastAsia="PingFang SC"/>
+                <w:sz w:val="18"/>
+              </w:rPr>
+              <w:t>0</w:t>
+            </w:r>
+          </w:p>
+        </w:tc>
+      </w:tr>
+      <w:tr>
+        <w:tc>
+          <w:tcPr>
+            <w:tcW w:type="dxa" w:w="1361"/>
+          </w:tcPr>
+          <w:p>
+            <w:pPr>
+              <w:jc w:val="left"/>
+            </w:pPr>
+            <w:r/>
+            <w:r>
+              <w:rPr>
+                <w:rFonts w:ascii="PingFang SC" w:hAnsi="PingFang SC" w:eastAsia="PingFang SC"/>
+                <w:sz w:val="18"/>
+              </w:rPr>
+              <w:t>gate</w:t>
+            </w:r>
+          </w:p>
+        </w:tc>
+        <w:tc>
+          <w:tcPr>
+            <w:tcW w:type="dxa" w:w="1361"/>
+          </w:tcPr>
+          <w:p>
+            <w:pPr>
+              <w:jc w:val="center"/>
+            </w:pPr>
+            <w:r/>
+            <w:r>
+              <w:rPr>
+                <w:rFonts w:ascii="PingFang SC" w:hAnsi="PingFang SC" w:eastAsia="PingFang SC"/>
+                <w:sz w:val="18"/>
+              </w:rPr>
+              <w:t>9/10</w:t>
+            </w:r>
+          </w:p>
+        </w:tc>
+        <w:tc>
+          <w:tcPr>
+            <w:tcW w:type="dxa" w:w="1587"/>
+          </w:tcPr>
+          <w:p>
+            <w:pPr>
+              <w:jc w:val="center"/>
+            </w:pPr>
+            <w:r/>
+            <w:r>
+              <w:rPr>
+                <w:rFonts w:ascii="PingFang SC" w:hAnsi="PingFang SC" w:eastAsia="PingFang SC"/>
+                <w:sz w:val="18"/>
+              </w:rPr>
+              <w:t>$0.1014</w:t>
+            </w:r>
+          </w:p>
+        </w:tc>
+        <w:tc>
+          <w:tcPr>
+            <w:tcW w:type="dxa" w:w="1474"/>
+          </w:tcPr>
+          <w:p>
+            <w:pPr>
+              <w:jc w:val="center"/>
+            </w:pPr>
+            <w:r/>
+            <w:r>
+              <w:rPr>
+                <w:rFonts w:ascii="PingFang SC" w:hAnsi="PingFang SC" w:eastAsia="PingFang SC"/>
+                <w:sz w:val="18"/>
+              </w:rPr>
+              <w:t>268</w:t>
+            </w:r>
+          </w:p>
+        </w:tc>
+        <w:tc>
+          <w:tcPr>
+            <w:tcW w:type="dxa" w:w="2268"/>
+          </w:tcPr>
+          <w:p>
+            <w:pPr>
+              <w:jc w:val="center"/>
+            </w:pPr>
+            <w:r/>
+            <w:r>
+              <w:rPr>
+                <w:rFonts w:ascii="PingFang SC" w:hAnsi="PingFang SC" w:eastAsia="PingFang SC"/>
+                <w:sz w:val="18"/>
+              </w:rPr>
+              <w:t>10</w:t>
+            </w:r>
+          </w:p>
+        </w:tc>
+      </w:tr>
+    </w:tbl>
+    <w:p>
+      <w:pPr>
+        <w:spacing w:after="40"/>
+      </w:pPr>
+    </w:p>
+    <w:p>
+      <w:pPr>
+        <w:pStyle w:val="ListBullet"/>
+        <w:spacing w:after="40"/>
+      </w:pPr>
+      <w:r>
+        <w:rPr>
+          <w:rFonts w:ascii="PingFang SC" w:hAnsi="PingFang SC" w:eastAsia="PingFang SC"/>
+          <w:sz w:val="21"/>
+        </w:rPr>
+        <w:t>retrieval 臂没有调用任何 code_search/repo_map/code_context/find_references；9/10 不能归因于检索工具。</w:t>
+      </w:r>
+    </w:p>
+    <w:p>
+      <w:pPr>
+        <w:pStyle w:val="ListBullet"/>
+        <w:spacing w:after="40"/>
+      </w:pPr>
+      <w:r>
+        <w:rPr>
+          <w:rFonts w:ascii="PingFang SC" w:hAnsi="PingFang SC" w:eastAsia="PingFang SC"/>
+          <w:sz w:val="21"/>
+        </w:rPr>
+        <w:t>gate 强制调用了 repo_map/code_search，与 retrieval 同为 9/10，但成本约 2 倍、调用 268 vs 139。</w:t>
+      </w:r>
+    </w:p>
+    <w:p>
+      <w:pPr>
+        <w:pStyle w:val="ListBullet"/>
+        <w:spacing w:after="40"/>
+      </w:pPr>
+      <w:r>
+        <w:rPr>
+          <w:rFonts w:ascii="PingFang SC" w:hAnsi="PingFang SC" w:eastAsia="PingFang SC"/>
+          <w:sz w:val="21"/>
+        </w:rPr>
+        <w:t>四臂均 10/10 completed，无空补丁、无评分错误；A/B 的 8/10 与 C/D 的 9/10 只差 1 题，单轮不显著。</w:t>
+      </w:r>
+    </w:p>
+    <w:p>
+      <w:pPr>
+        <w:spacing w:after="100" w:line="300" w:lineRule="auto"/>
+      </w:pPr>
+      <w:r>
+        <w:rPr>
+          <w:rFonts w:ascii="PingFang SC" w:hAnsi="PingFang SC" w:eastAsia="PingFang SC"/>
+          <w:b w:val="0"/>
+          <w:sz w:val="21"/>
+        </w:rPr>
+        <w:t>按预注册规则，工具调用为 0 时停止同一 config 的第二轮；先修工具曝光，或把 gate 明确当作package treatment。当前不能声称工具提升了解决率。</w:t>
+      </w:r>
+    </w:p>
+    <w:p>
+      <w:pPr>
         <w:spacing w:before="240" w:after="80"/>
       </w:pPr>
       <w:r>
@@ -3584,7 +4158,7 @@
                 <w:rFonts w:ascii="PingFang SC" w:hAnsi="PingFang SC" w:eastAsia="PingFang SC"/>
                 <w:sz w:val="18"/>
               </w:rPr>
-              <w:t>工具可用且兼容</w:t>
+              <w:t>四臂 8/8/9/9；retrieval 0 calls；gate 10 calls</w:t>
             </w:r>
           </w:p>
         </w:tc>
@@ -3602,7 +4176,7 @@
                 <w:rFonts w:ascii="PingFang SC" w:hAnsi="PingFang SC" w:eastAsia="PingFang SC"/>
                 <w:sz w:val="18"/>
               </w:rPr>
-              <w:t>未做 ablation</w:t>
+              <w:t>未验证/不支持</w:t>
             </w:r>
           </w:p>
         </w:tc>
@@ -3992,6 +4566,44 @@
                 <w:rFonts w:ascii="PingFang SC" w:hAnsi="PingFang SC" w:eastAsia="PingFang SC"/>
                 <w:sz w:val="18"/>
               </w:rPr>
+              <w:t>四臂工具 ablation</w:t>
+            </w:r>
+          </w:p>
+        </w:tc>
+        <w:tc>
+          <w:tcPr>
+            <w:tcW w:type="dxa" w:w="6803"/>
+          </w:tcPr>
+          <w:p>
+            <w:pPr>
+              <w:jc w:val="center"/>
+            </w:pPr>
+            <w:r/>
+            <w:r>
+              <w:rPr>
+                <w:rFonts w:ascii="PingFang SC" w:hAnsi="PingFang SC" w:eastAsia="PingFang SC"/>
+                <w:sz w:val="18"/>
+              </w:rPr>
+              <w:t>experiments/ablation5v5_20261018/FOUR_ARM_20261019.md</w:t>
+            </w:r>
+          </w:p>
+        </w:tc>
+      </w:tr>
+      <w:tr>
+        <w:tc>
+          <w:tcPr>
+            <w:tcW w:type="dxa" w:w="2381"/>
+          </w:tcPr>
+          <w:p>
+            <w:pPr>
+              <w:jc w:val="left"/>
+            </w:pPr>
+            <w:r/>
+            <w:r>
+              <w:rPr>
+                <w:rFonts w:ascii="PingFang SC" w:hAnsi="PingFang SC" w:eastAsia="PingFang SC"/>
+                <w:sz w:val="18"/>
+              </w:rPr>
               <w:t>检索归因</w:t>
             </w:r>
           </w:p>

</xml_diff>

<commit_message>
docs: record 250-step cap and retrieval prompt recheck
- 250 does not bind: four-arm peak was 91 calls.
- Stronger prompt still gives only 2/10 retrieval calls; 9/10 resolved, no tool-effect claim.
- Update README and final report.
</commit_message>
<xml_diff>
--- a/deliverables_final/report_20261019.docx
+++ b/deliverables_final/report_20261019.docx
@@ -3677,6 +3677,19 @@
     </w:p>
     <w:p>
       <w:pPr>
+        <w:spacing w:after="100" w:line="300" w:lineRule="auto"/>
+      </w:pPr>
+      <w:r>
+        <w:rPr>
+          <w:rFonts w:ascii="PingFang SC" w:hAnsi="PingFang SC" w:eastAsia="PingFang SC"/>
+          <w:b w:val="0"/>
+          <w:sz w:val="21"/>
+        </w:rPr>
+        <w:t>随后把四个 config 的 step_limit 从 400 降到 250。四臂实际最大调用为 91，250 不会 binding，因此既有 A/B/D 结果仍成立。给 retrieval 加“首次编辑前至少调用一次检索工具”的提示后，3 题 smoke 为 2/3、1 次 code_context；10 题 recheck 为 9/10、2 次 code_context、$0.0730。只有 2/10 题真正用了检索工具，解决数未变，treatment 仍基本未执行。</w:t>
+      </w:r>
+    </w:p>
+    <w:p>
+      <w:pPr>
         <w:spacing w:before="240" w:after="80"/>
       </w:pPr>
       <w:r>
@@ -4158,7 +4171,7 @@
                 <w:rFonts w:ascii="PingFang SC" w:hAnsi="PingFang SC" w:eastAsia="PingFang SC"/>
                 <w:sz w:val="18"/>
               </w:rPr>
-              <w:t>四臂 8/8/9/9；retrieval 0 calls；gate 10 calls</w:t>
+              <w:t>四臂 8/8/9/9；250 recheck 9/10、2 calls</w:t>
             </w:r>
           </w:p>
         </w:tc>

</xml_diff>